<commit_message>
Wrapper per la generazione di Report
</commit_message>
<xml_diff>
--- a/to-backend/docx_examples/template_full.docx
+++ b/to-backend/docx_examples/template_full.docx
@@ -6,14 +6,13 @@
       <w:pPr>
         <w:rPr>
           <w:rFonts w:ascii="Arial" w:hAnsi="Arial" w:cs="Arial"/>
+          <w:b/>
+          <w:bCs/>
+          <w:noProof/>
+          <w:sz w:val="28"/>
+          <w:szCs w:val="28"/>
         </w:rPr>
       </w:pPr>
-      <w:r>
-        <w:rPr>
-          <w:rFonts w:ascii="Arial" w:hAnsi="Arial" w:cs="Arial"/>
-        </w:rPr>
-        <w:t>-----------------------------------------------------</w:t>
-      </w:r>
     </w:p>
     <w:p>
       <w:pPr>
@@ -22,8 +21,8 @@
           <w:b/>
           <w:bCs/>
           <w:noProof/>
-          <w:sz w:val="32"/>
-          <w:szCs w:val="32"/>
+          <w:sz w:val="28"/>
+          <w:szCs w:val="28"/>
         </w:rPr>
       </w:pPr>
       <w:r>
@@ -32,8 +31,8 @@
           <w:b/>
           <w:bCs/>
           <w:noProof/>
-          <w:sz w:val="32"/>
-          <w:szCs w:val="32"/>
+          <w:sz w:val="28"/>
+          <w:szCs w:val="28"/>
         </w:rPr>
         <w:t>Tagliando {#</w:t>
       </w:r>
@@ -43,10 +42,10 @@
           <w:b/>
           <w:bCs/>
           <w:noProof/>
-          <w:sz w:val="32"/>
-          <w:szCs w:val="32"/>
-        </w:rPr>
-        <w:t>voucherNum</w:t>
+          <w:sz w:val="28"/>
+          <w:szCs w:val="28"/>
+        </w:rPr>
+        <w:t>numeroTalignadoStr</w:t>
       </w:r>
       <w:r>
         <w:rPr>
@@ -54,10 +53,419 @@
           <w:b/>
           <w:bCs/>
           <w:noProof/>
-          <w:sz w:val="32"/>
-          <w:szCs w:val="32"/>
+          <w:sz w:val="28"/>
+          <w:szCs w:val="28"/>
         </w:rPr>
         <w:t>#}</w:t>
+      </w:r>
+      <w:r>
+        <w:rPr>
+          <w:rFonts w:ascii="Arial" w:hAnsi="Arial" w:cs="Arial"/>
+          <w:b/>
+          <w:bCs/>
+          <w:noProof/>
+          <w:sz w:val="28"/>
+          <w:szCs w:val="28"/>
+        </w:rPr>
+        <w:br/>
+      </w:r>
+      <w:r>
+        <w:rPr>
+          <w:rFonts w:ascii="Arial" w:hAnsi="Arial" w:cs="Arial"/>
+          <w:b/>
+          <w:bCs/>
+          <w:sz w:val="28"/>
+          <w:szCs w:val="28"/>
+        </w:rPr>
+        <w:t>Per</w:t>
+      </w:r>
+      <w:r>
+        <w:rPr>
+          <w:rFonts w:ascii="Arial" w:hAnsi="Arial" w:cs="Arial"/>
+          <w:b/>
+          <w:bCs/>
+          <w:sz w:val="28"/>
+          <w:szCs w:val="28"/>
+        </w:rPr>
+        <w:t>:</w:t>
+      </w:r>
+      <w:r>
+        <w:rPr>
+          <w:rFonts w:ascii="Arial" w:hAnsi="Arial" w:cs="Arial"/>
+          <w:b/>
+          <w:bCs/>
+          <w:sz w:val="28"/>
+          <w:szCs w:val="28"/>
+        </w:rPr>
+        <w:t xml:space="preserve"> </w:t>
+      </w:r>
+      <w:r>
+        <w:rPr>
+          <w:rFonts w:ascii="Arial" w:hAnsi="Arial" w:cs="Arial"/>
+          <w:b/>
+          <w:bCs/>
+          <w:sz w:val="28"/>
+          <w:szCs w:val="28"/>
+        </w:rPr>
+        <w:t>{#</w:t>
+      </w:r>
+      <w:r>
+        <w:rPr>
+          <w:rFonts w:ascii="Arial" w:hAnsi="Arial" w:cs="Arial"/>
+          <w:b/>
+          <w:bCs/>
+          <w:sz w:val="28"/>
+          <w:szCs w:val="28"/>
+        </w:rPr>
+        <w:t>descrizionePermessoStr</w:t>
+      </w:r>
+      <w:r>
+        <w:rPr>
+          <w:rFonts w:ascii="Arial" w:hAnsi="Arial" w:cs="Arial"/>
+          <w:b/>
+          <w:bCs/>
+          <w:sz w:val="28"/>
+          <w:szCs w:val="28"/>
+        </w:rPr>
+        <w:t>#}</w:t>
+      </w:r>
+      <w:r>
+        <w:rPr>
+          <w:rFonts w:ascii="Arial" w:hAnsi="Arial" w:cs="Arial"/>
+          <w:b/>
+          <w:bCs/>
+          <w:sz w:val="28"/>
+          <w:szCs w:val="28"/>
+        </w:rPr>
+        <w:br/>
+      </w:r>
+      <w:r>
+        <w:rPr>
+          <w:rFonts w:ascii="Arial" w:hAnsi="Arial" w:cs="Arial"/>
+          <w:b/>
+          <w:bCs/>
+          <w:sz w:val="28"/>
+          <w:szCs w:val="28"/>
+        </w:rPr>
+        <w:t>T</w:t>
+      </w:r>
+      <w:r>
+        <w:rPr>
+          <w:rFonts w:ascii="Arial" w:hAnsi="Arial" w:cs="Arial"/>
+          <w:b/>
+          <w:bCs/>
+          <w:sz w:val="28"/>
+          <w:szCs w:val="28"/>
+        </w:rPr>
+        <w:t>arghe</w:t>
+      </w:r>
+      <w:r>
+        <w:rPr>
+          <w:rFonts w:ascii="Arial" w:hAnsi="Arial" w:cs="Arial"/>
+          <w:b/>
+          <w:bCs/>
+          <w:sz w:val="28"/>
+          <w:szCs w:val="28"/>
+        </w:rPr>
+        <w:t xml:space="preserve"> autorizzate</w:t>
+      </w:r>
+      <w:r>
+        <w:rPr>
+          <w:rFonts w:ascii="Arial" w:hAnsi="Arial" w:cs="Arial"/>
+          <w:b/>
+          <w:bCs/>
+          <w:sz w:val="28"/>
+          <w:szCs w:val="28"/>
+        </w:rPr>
+        <w:t>:</w:t>
+      </w:r>
+      <w:r>
+        <w:rPr>
+          <w:rFonts w:ascii="Arial" w:hAnsi="Arial" w:cs="Arial"/>
+          <w:b/>
+          <w:bCs/>
+          <w:sz w:val="28"/>
+          <w:szCs w:val="28"/>
+        </w:rPr>
+        <w:t xml:space="preserve"> </w:t>
+      </w:r>
+      <w:r>
+        <w:rPr>
+          <w:rFonts w:ascii="Arial" w:hAnsi="Arial" w:cs="Arial"/>
+          <w:b/>
+          <w:bCs/>
+          <w:sz w:val="28"/>
+          <w:szCs w:val="28"/>
+        </w:rPr>
+        <w:t>{#</w:t>
+      </w:r>
+      <w:r>
+        <w:rPr>
+          <w:rFonts w:ascii="Arial" w:hAnsi="Arial" w:cs="Arial"/>
+          <w:b/>
+          <w:bCs/>
+          <w:sz w:val="28"/>
+          <w:szCs w:val="28"/>
+        </w:rPr>
+        <w:t xml:space="preserve">FOR </w:t>
+      </w:r>
+      <w:proofErr w:type="spellStart"/>
+      <w:r>
+        <w:rPr>
+          <w:rFonts w:ascii="Arial" w:hAnsi="Arial" w:cs="Arial"/>
+          <w:b/>
+          <w:bCs/>
+          <w:sz w:val="28"/>
+          <w:szCs w:val="28"/>
+        </w:rPr>
+        <w:t>targaObj</w:t>
+      </w:r>
+      <w:proofErr w:type="spellEnd"/>
+      <w:r>
+        <w:rPr>
+          <w:rFonts w:ascii="Arial" w:hAnsi="Arial" w:cs="Arial"/>
+          <w:b/>
+          <w:bCs/>
+          <w:sz w:val="28"/>
+          <w:szCs w:val="28"/>
+        </w:rPr>
+        <w:t xml:space="preserve"> IN </w:t>
+      </w:r>
+      <w:proofErr w:type="spellStart"/>
+      <w:r>
+        <w:rPr>
+          <w:rFonts w:ascii="Arial" w:hAnsi="Arial" w:cs="Arial"/>
+          <w:b/>
+          <w:bCs/>
+          <w:sz w:val="28"/>
+          <w:szCs w:val="28"/>
+        </w:rPr>
+        <w:t>targheArr</w:t>
+      </w:r>
+      <w:proofErr w:type="spellEnd"/>
+      <w:r>
+        <w:rPr>
+          <w:rFonts w:ascii="Arial" w:hAnsi="Arial" w:cs="Arial"/>
+          <w:b/>
+          <w:bCs/>
+          <w:sz w:val="28"/>
+          <w:szCs w:val="28"/>
+        </w:rPr>
+        <w:t>#}</w:t>
+      </w:r>
+      <w:r>
+        <w:rPr>
+          <w:rFonts w:ascii="Arial" w:hAnsi="Arial" w:cs="Arial"/>
+          <w:b/>
+          <w:bCs/>
+          <w:sz w:val="28"/>
+          <w:szCs w:val="28"/>
+        </w:rPr>
+        <w:t xml:space="preserve"> </w:t>
+      </w:r>
+      <w:r>
+        <w:rPr>
+          <w:rFonts w:ascii="Arial" w:hAnsi="Arial" w:cs="Arial"/>
+          <w:b/>
+          <w:bCs/>
+          <w:sz w:val="28"/>
+          <w:szCs w:val="28"/>
+        </w:rPr>
+        <w:t>{#$idx</w:t>
+      </w:r>
+      <w:r>
+        <w:rPr>
+          <w:rFonts w:ascii="Arial" w:hAnsi="Arial" w:cs="Arial"/>
+          <w:b/>
+          <w:bCs/>
+          <w:sz w:val="28"/>
+          <w:szCs w:val="28"/>
+        </w:rPr>
+        <w:t xml:space="preserve"> + 1</w:t>
+      </w:r>
+      <w:r>
+        <w:rPr>
+          <w:rFonts w:ascii="Arial" w:hAnsi="Arial" w:cs="Arial"/>
+          <w:b/>
+          <w:bCs/>
+          <w:sz w:val="28"/>
+          <w:szCs w:val="28"/>
+        </w:rPr>
+        <w:t>#}</w:t>
+      </w:r>
+      <w:r>
+        <w:rPr>
+          <w:rFonts w:ascii="Arial" w:hAnsi="Arial" w:cs="Arial"/>
+          <w:b/>
+          <w:bCs/>
+          <w:sz w:val="28"/>
+          <w:szCs w:val="28"/>
+        </w:rPr>
+        <w:t>)</w:t>
+      </w:r>
+      <w:r>
+        <w:rPr>
+          <w:rFonts w:ascii="Arial" w:hAnsi="Arial" w:cs="Arial"/>
+          <w:b/>
+          <w:bCs/>
+          <w:sz w:val="28"/>
+          <w:szCs w:val="28"/>
+        </w:rPr>
+        <w:t xml:space="preserve">: </w:t>
+      </w:r>
+      <w:r>
+        <w:rPr>
+          <w:rFonts w:ascii="Arial" w:hAnsi="Arial" w:cs="Arial"/>
+          <w:b/>
+          <w:bCs/>
+          <w:sz w:val="28"/>
+          <w:szCs w:val="28"/>
+        </w:rPr>
+        <w:t>{#</w:t>
+      </w:r>
+      <w:r>
+        <w:rPr>
+          <w:rFonts w:ascii="Arial" w:hAnsi="Arial" w:cs="Arial"/>
+          <w:b/>
+          <w:bCs/>
+          <w:sz w:val="28"/>
+          <w:szCs w:val="28"/>
+        </w:rPr>
+        <w:t>INS $</w:t>
+      </w:r>
+      <w:proofErr w:type="spellStart"/>
+      <w:r>
+        <w:rPr>
+          <w:rFonts w:ascii="Arial" w:hAnsi="Arial" w:cs="Arial"/>
+          <w:b/>
+          <w:bCs/>
+          <w:sz w:val="28"/>
+          <w:szCs w:val="28"/>
+        </w:rPr>
+        <w:t>targaObj.targaStr</w:t>
+      </w:r>
+      <w:proofErr w:type="spellEnd"/>
+      <w:r>
+        <w:rPr>
+          <w:rFonts w:ascii="Arial" w:hAnsi="Arial" w:cs="Arial"/>
+          <w:b/>
+          <w:bCs/>
+          <w:sz w:val="28"/>
+          <w:szCs w:val="28"/>
+        </w:rPr>
+        <w:t>#}</w:t>
+      </w:r>
+      <w:r>
+        <w:rPr>
+          <w:rFonts w:ascii="Arial" w:hAnsi="Arial" w:cs="Arial"/>
+          <w:b/>
+          <w:bCs/>
+          <w:sz w:val="28"/>
+          <w:szCs w:val="28"/>
+        </w:rPr>
+        <w:t xml:space="preserve"> </w:t>
+      </w:r>
+      <w:r>
+        <w:rPr>
+          <w:rFonts w:ascii="Arial" w:hAnsi="Arial" w:cs="Arial"/>
+          <w:b/>
+          <w:bCs/>
+          <w:sz w:val="28"/>
+          <w:szCs w:val="28"/>
+        </w:rPr>
+        <w:br/>
+      </w:r>
+      <w:r>
+        <w:rPr>
+          <w:rFonts w:ascii="Arial" w:hAnsi="Arial" w:cs="Arial"/>
+          <w:b/>
+          <w:bCs/>
+          <w:sz w:val="28"/>
+          <w:szCs w:val="28"/>
+        </w:rPr>
+        <w:t>{#</w:t>
+      </w:r>
+      <w:r>
+        <w:rPr>
+          <w:rFonts w:ascii="Arial" w:hAnsi="Arial" w:cs="Arial"/>
+          <w:b/>
+          <w:bCs/>
+          <w:sz w:val="28"/>
+          <w:szCs w:val="28"/>
+        </w:rPr>
+        <w:t xml:space="preserve">END-FOR </w:t>
+      </w:r>
+      <w:proofErr w:type="spellStart"/>
+      <w:r>
+        <w:rPr>
+          <w:rFonts w:ascii="Arial" w:hAnsi="Arial" w:cs="Arial"/>
+          <w:b/>
+          <w:bCs/>
+          <w:sz w:val="28"/>
+          <w:szCs w:val="28"/>
+        </w:rPr>
+        <w:t>targaObj</w:t>
+      </w:r>
+      <w:proofErr w:type="spellEnd"/>
+      <w:r>
+        <w:rPr>
+          <w:rFonts w:ascii="Arial" w:hAnsi="Arial" w:cs="Arial"/>
+          <w:b/>
+          <w:bCs/>
+          <w:sz w:val="28"/>
+          <w:szCs w:val="28"/>
+        </w:rPr>
+        <w:t>#}</w:t>
+      </w:r>
+      <w:r>
+        <w:rPr>
+          <w:rFonts w:ascii="Arial" w:hAnsi="Arial" w:cs="Arial"/>
+          <w:b/>
+          <w:bCs/>
+          <w:sz w:val="28"/>
+          <w:szCs w:val="28"/>
+        </w:rPr>
+        <w:t xml:space="preserve"> </w:t>
+      </w:r>
+      <w:r>
+        <w:rPr>
+          <w:rFonts w:ascii="Arial" w:hAnsi="Arial" w:cs="Arial"/>
+          <w:b/>
+          <w:bCs/>
+          <w:sz w:val="28"/>
+          <w:szCs w:val="28"/>
+        </w:rPr>
+        <w:t xml:space="preserve">Data di scadenza: </w:t>
+      </w:r>
+      <w:r>
+        <w:rPr>
+          <w:rFonts w:ascii="Arial" w:hAnsi="Arial" w:cs="Arial"/>
+          <w:b/>
+          <w:bCs/>
+          <w:sz w:val="28"/>
+          <w:szCs w:val="28"/>
+        </w:rPr>
+        <w:t>{</w:t>
+      </w:r>
+      <w:r>
+        <w:rPr>
+          <w:rFonts w:ascii="Arial" w:hAnsi="Arial" w:cs="Arial"/>
+          <w:b/>
+          <w:bCs/>
+          <w:sz w:val="28"/>
+          <w:szCs w:val="28"/>
+        </w:rPr>
+        <w:t>#</w:t>
+      </w:r>
+      <w:r>
+        <w:rPr>
+          <w:rFonts w:ascii="Arial" w:hAnsi="Arial" w:cs="Arial"/>
+          <w:b/>
+          <w:bCs/>
+          <w:sz w:val="28"/>
+          <w:szCs w:val="28"/>
+        </w:rPr>
+        <w:t>dataFineValiditaStr</w:t>
       </w:r>
     </w:p>
     <w:p>
@@ -66,8 +474,8 @@
           <w:rFonts w:ascii="Arial" w:hAnsi="Arial" w:cs="Arial"/>
           <w:b/>
           <w:bCs/>
-          <w:sz w:val="32"/>
-          <w:szCs w:val="32"/>
+          <w:sz w:val="28"/>
+          <w:szCs w:val="28"/>
         </w:rPr>
       </w:pPr>
       <w:r>
@@ -75,102 +483,10 @@
           <w:rFonts w:ascii="Arial" w:hAnsi="Arial" w:cs="Arial"/>
           <w:b/>
           <w:bCs/>
-          <w:sz w:val="32"/>
-          <w:szCs w:val="32"/>
-        </w:rPr>
-        <w:t>Relativo al permesso</w:t>
-      </w:r>
-      <w:r>
-        <w:rPr>
-          <w:rFonts w:ascii="Arial" w:hAnsi="Arial" w:cs="Arial"/>
-          <w:b/>
-          <w:bCs/>
-          <w:sz w:val="32"/>
-          <w:szCs w:val="32"/>
-        </w:rPr>
-        <w:t>:</w:t>
-      </w:r>
-      <w:r>
-        <w:rPr>
-          <w:rFonts w:ascii="Arial" w:hAnsi="Arial" w:cs="Arial"/>
-          <w:b/>
-          <w:bCs/>
-          <w:sz w:val="32"/>
-          <w:szCs w:val="32"/>
-        </w:rPr>
-        <w:br/>
-      </w:r>
-      <w:r>
-        <w:rPr>
-          <w:rFonts w:ascii="Arial" w:hAnsi="Arial" w:cs="Arial"/>
-          <w:b/>
-          <w:bCs/>
-          <w:sz w:val="32"/>
-          <w:szCs w:val="32"/>
-        </w:rPr>
-        <w:t>{#permitStr#}</w:t>
-      </w:r>
-    </w:p>
-    <w:p>
-      <w:pPr>
-        <w:rPr>
-          <w:rFonts w:ascii="Arial" w:hAnsi="Arial" w:cs="Arial"/>
-          <w:b/>
-          <w:bCs/>
-          <w:sz w:val="32"/>
-          <w:szCs w:val="32"/>
-        </w:rPr>
-      </w:pPr>
-      <w:r>
-        <w:rPr>
-          <w:rFonts w:ascii="Arial" w:hAnsi="Arial" w:cs="Arial"/>
-          <w:b/>
-          <w:bCs/>
-          <w:sz w:val="32"/>
-          <w:szCs w:val="32"/>
-        </w:rPr>
-        <w:t>Comprendente le targhe:</w:t>
-      </w:r>
-      <w:r>
-        <w:rPr>
-          <w:rFonts w:ascii="Arial" w:hAnsi="Arial" w:cs="Arial"/>
-          <w:b/>
-          <w:bCs/>
-          <w:sz w:val="32"/>
-          <w:szCs w:val="32"/>
-        </w:rPr>
-        <w:br/>
-      </w:r>
-      <w:r>
-        <w:rPr>
-          <w:rFonts w:ascii="Arial" w:hAnsi="Arial" w:cs="Arial"/>
-          <w:b/>
-          <w:bCs/>
-          <w:sz w:val="32"/>
-          <w:szCs w:val="32"/>
-        </w:rPr>
-        <w:t>{#platesStr#}</w:t>
-      </w:r>
-    </w:p>
-    <w:p>
-      <w:pPr>
-        <w:rPr>
-          <w:rFonts w:ascii="Arial" w:hAnsi="Arial" w:cs="Arial"/>
-          <w:b/>
-          <w:bCs/>
-          <w:sz w:val="32"/>
-          <w:szCs w:val="32"/>
-        </w:rPr>
-      </w:pPr>
-      <w:r>
-        <w:rPr>
-          <w:rFonts w:ascii="Arial" w:hAnsi="Arial" w:cs="Arial"/>
-          <w:b/>
-          <w:bCs/>
-          <w:sz w:val="32"/>
-          <w:szCs w:val="32"/>
-        </w:rPr>
-        <w:t>Data di scadenza: {#expirationDateStr#}</w:t>
+          <w:sz w:val="28"/>
+          <w:szCs w:val="28"/>
+        </w:rPr>
+        <w:t>#}</w:t>
       </w:r>
     </w:p>
     <w:p>
@@ -227,6 +543,14 @@
         </w:rPr>
         <w:t>)#}</w:t>
       </w:r>
+    </w:p>
+    <w:p>
+      <w:pPr>
+        <w:jc w:val="right"/>
+        <w:rPr>
+          <w:rFonts w:ascii="Arial" w:hAnsi="Arial" w:cs="Arial"/>
+        </w:rPr>
+      </w:pPr>
     </w:p>
     <w:p>
       <w:pPr>
@@ -292,25 +616,49 @@
         <w:rPr>
           <w:rFonts w:ascii="Arial" w:hAnsi="Arial" w:cs="Arial"/>
         </w:rPr>
-        <w:t>{#voucherNum#}</w:t>
-      </w:r>
-      <w:r>
-        <w:rPr>
-          <w:rFonts w:ascii="Arial" w:hAnsi="Arial" w:cs="Arial"/>
-        </w:rPr>
-        <w:t xml:space="preserve"> è stato rilasciato a {#fi</w:t>
-      </w:r>
-      <w:r>
-        <w:rPr>
-          <w:rFonts w:ascii="Arial" w:hAnsi="Arial" w:cs="Arial"/>
-        </w:rPr>
-        <w:t>r</w:t>
-      </w:r>
-      <w:r>
-        <w:rPr>
-          <w:rFonts w:ascii="Arial" w:hAnsi="Arial" w:cs="Arial"/>
-        </w:rPr>
-        <w:t>stnameStr#} {#lastnameStr#}</w:t>
+        <w:t>{#</w:t>
+      </w:r>
+      <w:r>
+        <w:rPr>
+          <w:rFonts w:ascii="Arial" w:hAnsi="Arial" w:cs="Arial"/>
+        </w:rPr>
+        <w:t>numeroTalignadoStr</w:t>
+      </w:r>
+      <w:r>
+        <w:rPr>
+          <w:rFonts w:ascii="Arial" w:hAnsi="Arial" w:cs="Arial"/>
+        </w:rPr>
+        <w:t>#}</w:t>
+      </w:r>
+      <w:r>
+        <w:rPr>
+          <w:rFonts w:ascii="Arial" w:hAnsi="Arial" w:cs="Arial"/>
+        </w:rPr>
+        <w:t xml:space="preserve"> è stato rilasciato a {#</w:t>
+      </w:r>
+      <w:r>
+        <w:rPr>
+          <w:rFonts w:ascii="Arial" w:hAnsi="Arial" w:cs="Arial"/>
+        </w:rPr>
+        <w:t>cognomeRichiedenteStr</w:t>
+      </w:r>
+      <w:r>
+        <w:rPr>
+          <w:rFonts w:ascii="Arial" w:hAnsi="Arial" w:cs="Arial"/>
+        </w:rPr>
+        <w:t>#} {#</w:t>
+      </w:r>
+      <w:r>
+        <w:rPr>
+          <w:rFonts w:ascii="Arial" w:hAnsi="Arial" w:cs="Arial"/>
+        </w:rPr>
+        <w:t>nomeRichiedenteStr</w:t>
+      </w:r>
+      <w:r>
+        <w:rPr>
+          <w:rFonts w:ascii="Arial" w:hAnsi="Arial" w:cs="Arial"/>
+        </w:rPr>
+        <w:t>#}</w:t>
       </w:r>
     </w:p>
     <w:p>
@@ -409,7 +757,7 @@
           <wp:extent cx="445135" cy="685800"/>
           <wp:effectExtent l="0" t="0" r="0" b="0"/>
           <wp:wrapSquare wrapText="bothSides"/>
-          <wp:docPr id="1889673913" name="Immagine 5" descr="Copia di logo"/>
+          <wp:docPr id="1202773275" name="Immagine 5" descr="Copia di logo"/>
           <wp:cNvGraphicFramePr>
             <a:graphicFrameLocks xmlns:a="http://schemas.openxmlformats.org/drawingml/2006/main" noChangeAspect="1"/>
           </wp:cNvGraphicFramePr>
@@ -466,7 +814,7 @@
           <wp:extent cx="1083310" cy="708025"/>
           <wp:effectExtent l="0" t="0" r="0" b="0"/>
           <wp:wrapNone/>
-          <wp:docPr id="623542223" name="Immagine 6" descr="ISO14001_ita_col"/>
+          <wp:docPr id="546359329" name="Immagine 6" descr="ISO14001_ita_col"/>
           <wp:cNvGraphicFramePr>
             <a:graphicFrameLocks xmlns:a="http://schemas.openxmlformats.org/drawingml/2006/main" noChangeAspect="1"/>
           </wp:cNvGraphicFramePr>
@@ -1527,6 +1875,36 @@
     <w:uiPriority w:val="99"/>
     <w:rsid w:val="00B81385"/>
   </w:style>
+  <w:style w:type="paragraph" w:styleId="PreformattatoHTML">
+    <w:name w:val="HTML Preformatted"/>
+    <w:basedOn w:val="Normale"/>
+    <w:link w:val="PreformattatoHTMLCarattere"/>
+    <w:uiPriority w:val="99"/>
+    <w:semiHidden/>
+    <w:unhideWhenUsed/>
+    <w:rsid w:val="00D06D50"/>
+    <w:pPr>
+      <w:spacing w:after="0" w:line="240" w:lineRule="auto"/>
+    </w:pPr>
+    <w:rPr>
+      <w:rFonts w:ascii="Consolas" w:hAnsi="Consolas"/>
+      <w:sz w:val="20"/>
+      <w:szCs w:val="20"/>
+    </w:rPr>
+  </w:style>
+  <w:style w:type="character" w:customStyle="1" w:styleId="PreformattatoHTMLCarattere">
+    <w:name w:val="Preformattato HTML Carattere"/>
+    <w:basedOn w:val="Carpredefinitoparagrafo"/>
+    <w:link w:val="PreformattatoHTML"/>
+    <w:uiPriority w:val="99"/>
+    <w:semiHidden/>
+    <w:rsid w:val="00D06D50"/>
+    <w:rPr>
+      <w:rFonts w:ascii="Consolas" w:hAnsi="Consolas"/>
+      <w:sz w:val="20"/>
+      <w:szCs w:val="20"/>
+    </w:rPr>
+  </w:style>
 </w:styles>
 </file>
 

</xml_diff>